<commit_message>
requirement 1: add final content
requirement 6: add final content

requirement 7: fix freeze bug

fix freeze bug
</commit_message>
<xml_diff>
--- a/AI_midterm_group_ID_student_ID/source/requirement_4/heuristic_report.docx
+++ b/AI_midterm_group_ID_student_ID/source/requirement_4/heuristic_report.docx
@@ -600,26 +600,6 @@
                 <m:t>k</m:t>
               </m:r>
             </m:sup>
-            <m:e/>
-          </m:nary>
-          <m:r>
-            <w:rPr>
-              <w:rFonts w:ascii="Times New Roman" w:eastAsia="Times New Roman" w:hAnsi="Times New Roman" w:cs="Times New Roman"/>
-              <w:sz w:val="26"/>
-              <w:szCs w:val="26"/>
-            </w:rPr>
-            <m:t>w(</m:t>
-          </m:r>
-          <m:sSub>
-            <m:sSubPr>
-              <m:ctrlPr>
-                <w:rPr>
-                  <w:rFonts w:ascii="Times New Roman" w:eastAsia="Times New Roman" w:hAnsi="Times New Roman" w:cs="Times New Roman"/>
-                  <w:sz w:val="26"/>
-                  <w:szCs w:val="26"/>
-                </w:rPr>
-              </m:ctrlPr>
-            </m:sSubPr>
             <m:e>
               <m:r>
                 <w:rPr>
@@ -627,67 +607,88 @@
                   <w:sz w:val="26"/>
                   <w:szCs w:val="26"/>
                 </w:rPr>
-                <m:t>b</m:t>
+                <m:t>w(</m:t>
               </m:r>
-            </m:e>
-            <m:sub>
+              <m:sSub>
+                <m:sSubPr>
+                  <m:ctrlPr>
+                    <w:rPr>
+                      <w:rFonts w:ascii="Times New Roman" w:eastAsia="Times New Roman" w:hAnsi="Times New Roman" w:cs="Times New Roman"/>
+                      <w:sz w:val="26"/>
+                      <w:szCs w:val="26"/>
+                    </w:rPr>
+                  </m:ctrlPr>
+                </m:sSubPr>
+                <m:e>
+                  <m:r>
+                    <w:rPr>
+                      <w:rFonts w:ascii="Times New Roman" w:eastAsia="Times New Roman" w:hAnsi="Times New Roman" w:cs="Times New Roman"/>
+                      <w:sz w:val="26"/>
+                      <w:szCs w:val="26"/>
+                    </w:rPr>
+                    <m:t>b</m:t>
+                  </m:r>
+                </m:e>
+                <m:sub>
+                  <m:r>
+                    <w:rPr>
+                      <w:rFonts w:ascii="Times New Roman" w:eastAsia="Times New Roman" w:hAnsi="Times New Roman" w:cs="Times New Roman"/>
+                      <w:sz w:val="26"/>
+                      <w:szCs w:val="26"/>
+                    </w:rPr>
+                    <m:t>i</m:t>
+                  </m:r>
+                </m:sub>
+              </m:sSub>
               <m:r>
                 <w:rPr>
                   <w:rFonts w:ascii="Times New Roman" w:eastAsia="Times New Roman" w:hAnsi="Times New Roman" w:cs="Times New Roman"/>
                   <w:sz w:val="26"/>
                   <w:szCs w:val="26"/>
                 </w:rPr>
-                <m:t>i</m:t>
+                <m:t>,π(</m:t>
               </m:r>
-            </m:sub>
-          </m:sSub>
-          <m:r>
-            <w:rPr>
-              <w:rFonts w:ascii="Times New Roman" w:eastAsia="Times New Roman" w:hAnsi="Times New Roman" w:cs="Times New Roman"/>
-              <w:sz w:val="26"/>
-              <w:szCs w:val="26"/>
-            </w:rPr>
-            <m:t>,π(</m:t>
-          </m:r>
-          <m:sSub>
-            <m:sSubPr>
-              <m:ctrlPr>
-                <w:rPr>
-                  <w:rFonts w:ascii="Times New Roman" w:eastAsia="Times New Roman" w:hAnsi="Times New Roman" w:cs="Times New Roman"/>
-                  <w:sz w:val="26"/>
-                  <w:szCs w:val="26"/>
-                </w:rPr>
-              </m:ctrlPr>
-            </m:sSubPr>
-            <m:e>
+              <m:sSub>
+                <m:sSubPr>
+                  <m:ctrlPr>
+                    <w:rPr>
+                      <w:rFonts w:ascii="Times New Roman" w:eastAsia="Times New Roman" w:hAnsi="Times New Roman" w:cs="Times New Roman"/>
+                      <w:sz w:val="26"/>
+                      <w:szCs w:val="26"/>
+                    </w:rPr>
+                  </m:ctrlPr>
+                </m:sSubPr>
+                <m:e>
+                  <m:r>
+                    <w:rPr>
+                      <w:rFonts w:ascii="Times New Roman" w:eastAsia="Times New Roman" w:hAnsi="Times New Roman" w:cs="Times New Roman"/>
+                      <w:sz w:val="26"/>
+                      <w:szCs w:val="26"/>
+                    </w:rPr>
+                    <m:t>b</m:t>
+                  </m:r>
+                </m:e>
+                <m:sub>
+                  <m:r>
+                    <w:rPr>
+                      <w:rFonts w:ascii="Times New Roman" w:eastAsia="Times New Roman" w:hAnsi="Times New Roman" w:cs="Times New Roman"/>
+                      <w:sz w:val="26"/>
+                      <w:szCs w:val="26"/>
+                    </w:rPr>
+                    <m:t>i</m:t>
+                  </m:r>
+                </m:sub>
+              </m:sSub>
               <m:r>
                 <w:rPr>
                   <w:rFonts w:ascii="Times New Roman" w:eastAsia="Times New Roman" w:hAnsi="Times New Roman" w:cs="Times New Roman"/>
                   <w:sz w:val="26"/>
                   <w:szCs w:val="26"/>
                 </w:rPr>
-                <m:t>b</m:t>
+                <m:t>))</m:t>
               </m:r>
             </m:e>
-            <m:sub>
-              <m:r>
-                <w:rPr>
-                  <w:rFonts w:ascii="Times New Roman" w:eastAsia="Times New Roman" w:hAnsi="Times New Roman" w:cs="Times New Roman"/>
-                  <w:sz w:val="26"/>
-                  <w:szCs w:val="26"/>
-                </w:rPr>
-                <m:t>i</m:t>
-              </m:r>
-            </m:sub>
-          </m:sSub>
-          <m:r>
-            <w:rPr>
-              <w:rFonts w:ascii="Times New Roman" w:eastAsia="Times New Roman" w:hAnsi="Times New Roman" w:cs="Times New Roman"/>
-              <w:sz w:val="26"/>
-              <w:szCs w:val="26"/>
-            </w:rPr>
-            <m:t>))</m:t>
-          </m:r>
+          </m:nary>
         </m:oMath>
       </m:oMathPara>
     </w:p>
@@ -1530,26 +1531,6 @@
               <m:t>k</m:t>
             </m:r>
           </m:sup>
-          <m:e/>
-        </m:nary>
-        <m:r>
-          <w:rPr>
-            <w:rFonts w:ascii="Times New Roman" w:eastAsia="Times New Roman" w:hAnsi="Times New Roman" w:cs="Times New Roman"/>
-            <w:sz w:val="26"/>
-            <w:szCs w:val="26"/>
-          </w:rPr>
-          <m:t>w(</m:t>
-        </m:r>
-        <m:sSub>
-          <m:sSubPr>
-            <m:ctrlPr>
-              <w:rPr>
-                <w:rFonts w:ascii="Times New Roman" w:eastAsia="Times New Roman" w:hAnsi="Times New Roman" w:cs="Times New Roman"/>
-                <w:sz w:val="26"/>
-                <w:szCs w:val="26"/>
-              </w:rPr>
-            </m:ctrlPr>
-          </m:sSubPr>
           <m:e>
             <m:r>
               <w:rPr>
@@ -1557,87 +1538,7 @@
                 <w:sz w:val="26"/>
                 <w:szCs w:val="26"/>
               </w:rPr>
-              <m:t>b</m:t>
-            </m:r>
-          </m:e>
-          <m:sub>
-            <m:r>
-              <w:rPr>
-                <w:rFonts w:ascii="Times New Roman" w:eastAsia="Times New Roman" w:hAnsi="Times New Roman" w:cs="Times New Roman"/>
-                <w:sz w:val="26"/>
-                <w:szCs w:val="26"/>
-              </w:rPr>
-              <m:t>i</m:t>
-            </m:r>
-          </m:sub>
-        </m:sSub>
-        <m:r>
-          <w:rPr>
-            <w:rFonts w:ascii="Times New Roman" w:eastAsia="Times New Roman" w:hAnsi="Times New Roman" w:cs="Times New Roman"/>
-            <w:sz w:val="26"/>
-            <w:szCs w:val="26"/>
-          </w:rPr>
-          <m:t>,</m:t>
-        </m:r>
-        <m:sSub>
-          <m:sSubPr>
-            <m:ctrlPr>
-              <w:rPr>
-                <w:rFonts w:ascii="Times New Roman" w:eastAsia="Times New Roman" w:hAnsi="Times New Roman" w:cs="Times New Roman"/>
-                <w:sz w:val="26"/>
-                <w:szCs w:val="26"/>
-              </w:rPr>
-            </m:ctrlPr>
-          </m:sSubPr>
-          <m:e>
-            <m:r>
-              <w:rPr>
-                <w:rFonts w:ascii="Times New Roman" w:eastAsia="Times New Roman" w:hAnsi="Times New Roman" w:cs="Times New Roman"/>
-                <w:sz w:val="26"/>
-                <w:szCs w:val="26"/>
-              </w:rPr>
-              <m:t>d</m:t>
-            </m:r>
-          </m:e>
-          <m:sub>
-            <m:sSup>
-              <m:sSupPr>
-                <m:ctrlPr>
-                  <w:rPr>
-                    <w:rFonts w:ascii="Times New Roman" w:eastAsia="Times New Roman" w:hAnsi="Times New Roman" w:cs="Times New Roman"/>
-                    <w:sz w:val="26"/>
-                    <w:szCs w:val="26"/>
-                  </w:rPr>
-                </m:ctrlPr>
-              </m:sSupPr>
-              <m:e>
-                <m:r>
-                  <w:rPr>
-                    <w:rFonts w:ascii="Times New Roman" w:eastAsia="Times New Roman" w:hAnsi="Times New Roman" w:cs="Times New Roman"/>
-                    <w:sz w:val="26"/>
-                    <w:szCs w:val="26"/>
-                  </w:rPr>
-                  <m:t>π</m:t>
-                </m:r>
-              </m:e>
-              <m:sup>
-                <m:r>
-                  <w:rPr>
-                    <w:rFonts w:ascii="Times New Roman" w:eastAsia="Times New Roman" w:hAnsi="Times New Roman" w:cs="Times New Roman"/>
-                    <w:sz w:val="26"/>
-                    <w:szCs w:val="26"/>
-                  </w:rPr>
-                  <m:t>*</m:t>
-                </m:r>
-              </m:sup>
-            </m:sSup>
-            <m:r>
-              <w:rPr>
-                <w:rFonts w:ascii="Times New Roman" w:eastAsia="Times New Roman" w:hAnsi="Times New Roman" w:cs="Times New Roman"/>
-                <w:sz w:val="26"/>
-                <w:szCs w:val="26"/>
-              </w:rPr>
-              <m:t>(</m:t>
+              <m:t>w(</m:t>
             </m:r>
             <m:sSub>
               <m:sSubPr>
@@ -1676,255 +1577,7 @@
                 <w:sz w:val="26"/>
                 <w:szCs w:val="26"/>
               </w:rPr>
-              <m:t>)</m:t>
-            </m:r>
-          </m:sub>
-        </m:sSub>
-        <m:r>
-          <w:rPr>
-            <w:rFonts w:ascii="Times New Roman" w:eastAsia="Times New Roman" w:hAnsi="Times New Roman" w:cs="Times New Roman"/>
-            <w:sz w:val="26"/>
-            <w:szCs w:val="26"/>
-          </w:rPr>
-          <m:t>)</m:t>
-        </m:r>
-      </m:oMath>
-      <w:r>
-        <w:rPr>
-          <w:rFonts w:ascii="Times New Roman" w:eastAsia="Times New Roman" w:hAnsi="Times New Roman" w:cs="Times New Roman"/>
-          <w:sz w:val="26"/>
-          <w:szCs w:val="26"/>
-        </w:rPr>
-        <w:t>.</w:t>
-      </w:r>
-    </w:p>
-    <w:p>
-      <w:pPr>
-        <w:numPr>
-          <w:ilvl w:val="0"/>
-          <w:numId w:val="3"/>
-        </w:numPr>
-        <w:rPr>
-          <w:rFonts w:ascii="Times New Roman" w:eastAsia="Times New Roman" w:hAnsi="Times New Roman" w:cs="Times New Roman"/>
-          <w:sz w:val="26"/>
-          <w:szCs w:val="26"/>
-        </w:rPr>
-      </w:pPr>
-      <w:r>
-        <w:rPr>
-          <w:rFonts w:ascii="Times New Roman" w:eastAsia="Times New Roman" w:hAnsi="Times New Roman" w:cs="Times New Roman"/>
-          <w:sz w:val="26"/>
-          <w:szCs w:val="26"/>
-        </w:rPr>
-        <w:t xml:space="preserve">By definition, </w:t>
-      </w:r>
-      <m:oMath>
-        <m:r>
-          <w:rPr>
-            <w:rFonts w:ascii="Times New Roman" w:eastAsia="Times New Roman" w:hAnsi="Times New Roman" w:cs="Times New Roman"/>
-            <w:sz w:val="26"/>
-            <w:szCs w:val="26"/>
-          </w:rPr>
-          <m:t>h(s)</m:t>
-        </m:r>
-      </m:oMath>
-      <w:r>
-        <w:rPr>
-          <w:rFonts w:ascii="Times New Roman" w:eastAsia="Times New Roman" w:hAnsi="Times New Roman" w:cs="Times New Roman"/>
-          <w:sz w:val="26"/>
-          <w:szCs w:val="26"/>
-        </w:rPr>
-        <w:t xml:space="preserve"> is the minimum possible sum over </w:t>
-      </w:r>
-      <w:r>
-        <w:rPr>
-          <w:rFonts w:ascii="Times New Roman" w:eastAsia="Times New Roman" w:hAnsi="Times New Roman" w:cs="Times New Roman"/>
-          <w:i/>
-          <w:iCs/>
-          <w:sz w:val="26"/>
-          <w:szCs w:val="26"/>
-        </w:rPr>
-        <w:t>all</w:t>
-      </w:r>
-      <w:r>
-        <w:rPr>
-          <w:rFonts w:ascii="Times New Roman" w:eastAsia="Times New Roman" w:hAnsi="Times New Roman" w:cs="Times New Roman"/>
-          <w:sz w:val="26"/>
-          <w:szCs w:val="26"/>
-        </w:rPr>
-        <w:t xml:space="preserve"> permutations. Therefore:</w:t>
-      </w:r>
-      <w:r>
-        <w:rPr>
-          <w:rFonts w:ascii="Times New Roman" w:eastAsia="Times New Roman" w:hAnsi="Times New Roman" w:cs="Times New Roman"/>
-          <w:sz w:val="26"/>
-          <w:szCs w:val="26"/>
-        </w:rPr>
-        <w:br/>
-      </w:r>
-    </w:p>
-    <w:p>
-      <w:pPr>
-        <w:numPr>
-          <w:ilvl w:val="0"/>
-          <w:numId w:val="3"/>
-        </w:numPr>
-        <w:jc w:val="center"/>
-        <w:rPr>
-          <w:rFonts w:ascii="Times New Roman" w:eastAsia="Times New Roman" w:hAnsi="Times New Roman" w:cs="Times New Roman"/>
-          <w:sz w:val="26"/>
-          <w:szCs w:val="26"/>
-        </w:rPr>
-      </w:pPr>
-      <m:oMath>
-        <m:r>
-          <w:rPr>
-            <w:rFonts w:ascii="Times New Roman" w:eastAsia="Times New Roman" w:hAnsi="Times New Roman" w:cs="Times New Roman"/>
-            <w:sz w:val="26"/>
-            <w:szCs w:val="26"/>
-          </w:rPr>
-          <w:lastRenderedPageBreak/>
-          <m:t>h(s)≤</m:t>
-        </m:r>
-        <m:nary>
-          <m:naryPr>
-            <m:chr m:val="∑"/>
-            <m:ctrlPr>
-              <w:rPr>
-                <w:rFonts w:ascii="Times New Roman" w:eastAsia="Times New Roman" w:hAnsi="Times New Roman" w:cs="Times New Roman"/>
-                <w:sz w:val="26"/>
-                <w:szCs w:val="26"/>
-              </w:rPr>
-            </m:ctrlPr>
-          </m:naryPr>
-          <m:sub>
-            <m:r>
-              <w:rPr>
-                <w:rFonts w:ascii="Times New Roman" w:eastAsia="Times New Roman" w:hAnsi="Times New Roman" w:cs="Times New Roman"/>
-                <w:sz w:val="26"/>
-                <w:szCs w:val="26"/>
-              </w:rPr>
-              <m:t>i=1</m:t>
-            </m:r>
-          </m:sub>
-          <m:sup>
-            <m:r>
-              <w:rPr>
-                <w:rFonts w:ascii="Times New Roman" w:eastAsia="Times New Roman" w:hAnsi="Times New Roman" w:cs="Times New Roman"/>
-                <w:sz w:val="26"/>
-                <w:szCs w:val="26"/>
-              </w:rPr>
-              <m:t>k</m:t>
-            </m:r>
-          </m:sup>
-          <m:e/>
-        </m:nary>
-        <m:r>
-          <w:rPr>
-            <w:rFonts w:ascii="Times New Roman" w:eastAsia="Times New Roman" w:hAnsi="Times New Roman" w:cs="Times New Roman"/>
-            <w:sz w:val="26"/>
-            <w:szCs w:val="26"/>
-          </w:rPr>
-          <m:t>w(</m:t>
-        </m:r>
-        <m:sSub>
-          <m:sSubPr>
-            <m:ctrlPr>
-              <w:rPr>
-                <w:rFonts w:ascii="Times New Roman" w:eastAsia="Times New Roman" w:hAnsi="Times New Roman" w:cs="Times New Roman"/>
-                <w:sz w:val="26"/>
-                <w:szCs w:val="26"/>
-              </w:rPr>
-            </m:ctrlPr>
-          </m:sSubPr>
-          <m:e>
-            <m:r>
-              <w:rPr>
-                <w:rFonts w:ascii="Times New Roman" w:eastAsia="Times New Roman" w:hAnsi="Times New Roman" w:cs="Times New Roman"/>
-                <w:sz w:val="26"/>
-                <w:szCs w:val="26"/>
-              </w:rPr>
-              <m:t>b</m:t>
-            </m:r>
-          </m:e>
-          <m:sub>
-            <m:r>
-              <w:rPr>
-                <w:rFonts w:ascii="Times New Roman" w:eastAsia="Times New Roman" w:hAnsi="Times New Roman" w:cs="Times New Roman"/>
-                <w:sz w:val="26"/>
-                <w:szCs w:val="26"/>
-              </w:rPr>
-              <m:t>i</m:t>
-            </m:r>
-          </m:sub>
-        </m:sSub>
-        <m:r>
-          <w:rPr>
-            <w:rFonts w:ascii="Times New Roman" w:eastAsia="Times New Roman" w:hAnsi="Times New Roman" w:cs="Times New Roman"/>
-            <w:sz w:val="26"/>
-            <w:szCs w:val="26"/>
-          </w:rPr>
-          <m:t>,</m:t>
-        </m:r>
-        <m:sSub>
-          <m:sSubPr>
-            <m:ctrlPr>
-              <w:rPr>
-                <w:rFonts w:ascii="Times New Roman" w:eastAsia="Times New Roman" w:hAnsi="Times New Roman" w:cs="Times New Roman"/>
-                <w:sz w:val="26"/>
-                <w:szCs w:val="26"/>
-              </w:rPr>
-            </m:ctrlPr>
-          </m:sSubPr>
-          <m:e>
-            <m:r>
-              <w:rPr>
-                <w:rFonts w:ascii="Times New Roman" w:eastAsia="Times New Roman" w:hAnsi="Times New Roman" w:cs="Times New Roman"/>
-                <w:sz w:val="26"/>
-                <w:szCs w:val="26"/>
-              </w:rPr>
-              <m:t>d</m:t>
-            </m:r>
-          </m:e>
-          <m:sub>
-            <m:sSup>
-              <m:sSupPr>
-                <m:ctrlPr>
-                  <w:rPr>
-                    <w:rFonts w:ascii="Times New Roman" w:eastAsia="Times New Roman" w:hAnsi="Times New Roman" w:cs="Times New Roman"/>
-                    <w:sz w:val="26"/>
-                    <w:szCs w:val="26"/>
-                  </w:rPr>
-                </m:ctrlPr>
-              </m:sSupPr>
-              <m:e>
-                <m:r>
-                  <w:rPr>
-                    <w:rFonts w:ascii="Times New Roman" w:eastAsia="Times New Roman" w:hAnsi="Times New Roman" w:cs="Times New Roman"/>
-                    <w:sz w:val="26"/>
-                    <w:szCs w:val="26"/>
-                  </w:rPr>
-                  <m:t>π</m:t>
-                </m:r>
-              </m:e>
-              <m:sup>
-                <m:r>
-                  <w:rPr>
-                    <w:rFonts w:ascii="Times New Roman" w:eastAsia="Times New Roman" w:hAnsi="Times New Roman" w:cs="Times New Roman"/>
-                    <w:sz w:val="26"/>
-                    <w:szCs w:val="26"/>
-                  </w:rPr>
-                  <m:t>*</m:t>
-                </m:r>
-              </m:sup>
-            </m:sSup>
-            <m:r>
-              <w:rPr>
-                <w:rFonts w:ascii="Times New Roman" w:eastAsia="Times New Roman" w:hAnsi="Times New Roman" w:cs="Times New Roman"/>
-                <w:sz w:val="26"/>
-                <w:szCs w:val="26"/>
-              </w:rPr>
-              <m:t>(</m:t>
+              <m:t>,</m:t>
             </m:r>
             <m:sSub>
               <m:sSubPr>
@@ -1943,17 +1596,87 @@
                     <w:sz w:val="26"/>
                     <w:szCs w:val="26"/>
                   </w:rPr>
-                  <m:t>b</m:t>
+                  <m:t>d</m:t>
                 </m:r>
               </m:e>
               <m:sub>
+                <m:sSup>
+                  <m:sSupPr>
+                    <m:ctrlPr>
+                      <w:rPr>
+                        <w:rFonts w:ascii="Times New Roman" w:eastAsia="Times New Roman" w:hAnsi="Times New Roman" w:cs="Times New Roman"/>
+                        <w:sz w:val="26"/>
+                        <w:szCs w:val="26"/>
+                      </w:rPr>
+                    </m:ctrlPr>
+                  </m:sSupPr>
+                  <m:e>
+                    <m:r>
+                      <w:rPr>
+                        <w:rFonts w:ascii="Times New Roman" w:eastAsia="Times New Roman" w:hAnsi="Times New Roman" w:cs="Times New Roman"/>
+                        <w:sz w:val="26"/>
+                        <w:szCs w:val="26"/>
+                      </w:rPr>
+                      <m:t>π</m:t>
+                    </m:r>
+                  </m:e>
+                  <m:sup>
+                    <m:r>
+                      <w:rPr>
+                        <w:rFonts w:ascii="Times New Roman" w:eastAsia="Times New Roman" w:hAnsi="Times New Roman" w:cs="Times New Roman"/>
+                        <w:sz w:val="26"/>
+                        <w:szCs w:val="26"/>
+                      </w:rPr>
+                      <m:t>*</m:t>
+                    </m:r>
+                  </m:sup>
+                </m:sSup>
                 <m:r>
                   <w:rPr>
                     <w:rFonts w:ascii="Times New Roman" w:eastAsia="Times New Roman" w:hAnsi="Times New Roman" w:cs="Times New Roman"/>
                     <w:sz w:val="26"/>
                     <w:szCs w:val="26"/>
                   </w:rPr>
-                  <m:t>i</m:t>
+                  <m:t>(</m:t>
+                </m:r>
+                <m:sSub>
+                  <m:sSubPr>
+                    <m:ctrlPr>
+                      <w:rPr>
+                        <w:rFonts w:ascii="Times New Roman" w:eastAsia="Times New Roman" w:hAnsi="Times New Roman" w:cs="Times New Roman"/>
+                        <w:sz w:val="26"/>
+                        <w:szCs w:val="26"/>
+                      </w:rPr>
+                    </m:ctrlPr>
+                  </m:sSubPr>
+                  <m:e>
+                    <m:r>
+                      <w:rPr>
+                        <w:rFonts w:ascii="Times New Roman" w:eastAsia="Times New Roman" w:hAnsi="Times New Roman" w:cs="Times New Roman"/>
+                        <w:sz w:val="26"/>
+                        <w:szCs w:val="26"/>
+                      </w:rPr>
+                      <m:t>b</m:t>
+                    </m:r>
+                  </m:e>
+                  <m:sub>
+                    <m:r>
+                      <w:rPr>
+                        <w:rFonts w:ascii="Times New Roman" w:eastAsia="Times New Roman" w:hAnsi="Times New Roman" w:cs="Times New Roman"/>
+                        <w:sz w:val="26"/>
+                        <w:szCs w:val="26"/>
+                      </w:rPr>
+                      <m:t>i</m:t>
+                    </m:r>
+                  </m:sub>
+                </m:sSub>
+                <m:r>
+                  <w:rPr>
+                    <w:rFonts w:ascii="Times New Roman" w:eastAsia="Times New Roman" w:hAnsi="Times New Roman" w:cs="Times New Roman"/>
+                    <w:sz w:val="26"/>
+                    <w:szCs w:val="26"/>
+                  </w:rPr>
+                  <m:t>)</m:t>
                 </m:r>
               </m:sub>
             </m:sSub>
@@ -1965,56 +1688,335 @@
               </w:rPr>
               <m:t>)</m:t>
             </m:r>
-          </m:sub>
-        </m:sSub>
+          </m:e>
+        </m:nary>
+      </m:oMath>
+      <w:r>
+        <w:rPr>
+          <w:rFonts w:ascii="Times New Roman" w:eastAsia="Times New Roman" w:hAnsi="Times New Roman" w:cs="Times New Roman"/>
+          <w:sz w:val="26"/>
+          <w:szCs w:val="26"/>
+        </w:rPr>
+        <w:t>.</w:t>
+      </w:r>
+    </w:p>
+    <w:p>
+      <w:pPr>
+        <w:numPr>
+          <w:ilvl w:val="0"/>
+          <w:numId w:val="3"/>
+        </w:numPr>
+        <w:rPr>
+          <w:rFonts w:ascii="Times New Roman" w:eastAsia="Times New Roman" w:hAnsi="Times New Roman" w:cs="Times New Roman"/>
+          <w:sz w:val="26"/>
+          <w:szCs w:val="26"/>
+        </w:rPr>
+      </w:pPr>
+      <w:r>
+        <w:rPr>
+          <w:rFonts w:ascii="Times New Roman" w:eastAsia="Times New Roman" w:hAnsi="Times New Roman" w:cs="Times New Roman"/>
+          <w:sz w:val="26"/>
+          <w:szCs w:val="26"/>
+        </w:rPr>
+        <w:t xml:space="preserve">By definition, </w:t>
+      </w:r>
+      <m:oMath>
         <m:r>
           <w:rPr>
             <w:rFonts w:ascii="Times New Roman" w:eastAsia="Times New Roman" w:hAnsi="Times New Roman" w:cs="Times New Roman"/>
             <w:sz w:val="26"/>
             <w:szCs w:val="26"/>
           </w:rPr>
-          <m:t>)≤</m:t>
-        </m:r>
-        <m:sSup>
-          <m:sSupPr>
-            <m:ctrlPr>
-              <w:rPr>
-                <w:rFonts w:ascii="Times New Roman" w:eastAsia="Times New Roman" w:hAnsi="Times New Roman" w:cs="Times New Roman"/>
-                <w:sz w:val="26"/>
-                <w:szCs w:val="26"/>
-              </w:rPr>
-            </m:ctrlPr>
-          </m:sSupPr>
-          <m:e>
-            <m:r>
-              <w:rPr>
-                <w:rFonts w:ascii="Times New Roman" w:eastAsia="Times New Roman" w:hAnsi="Times New Roman" w:cs="Times New Roman"/>
-                <w:sz w:val="26"/>
-                <w:szCs w:val="26"/>
-              </w:rPr>
-              <m:t>h</m:t>
-            </m:r>
-          </m:e>
-          <m:sup>
-            <m:r>
-              <w:rPr>
-                <w:rFonts w:ascii="Times New Roman" w:eastAsia="Times New Roman" w:hAnsi="Times New Roman" w:cs="Times New Roman"/>
-                <w:sz w:val="26"/>
-                <w:szCs w:val="26"/>
-              </w:rPr>
-              <m:t>*</m:t>
-            </m:r>
-          </m:sup>
-        </m:sSup>
-        <m:r>
-          <w:rPr>
-            <w:rFonts w:ascii="Times New Roman" w:eastAsia="Times New Roman" w:hAnsi="Times New Roman" w:cs="Times New Roman"/>
-            <w:sz w:val="26"/>
-            <w:szCs w:val="26"/>
-          </w:rPr>
-          <m:t>(s)</m:t>
+          <m:t>h(s)</m:t>
         </m:r>
       </m:oMath>
+      <w:r>
+        <w:rPr>
+          <w:rFonts w:ascii="Times New Roman" w:eastAsia="Times New Roman" w:hAnsi="Times New Roman" w:cs="Times New Roman"/>
+          <w:sz w:val="26"/>
+          <w:szCs w:val="26"/>
+        </w:rPr>
+        <w:t xml:space="preserve"> is the minimum possible sum over </w:t>
+      </w:r>
+      <w:r>
+        <w:rPr>
+          <w:rFonts w:ascii="Times New Roman" w:eastAsia="Times New Roman" w:hAnsi="Times New Roman" w:cs="Times New Roman"/>
+          <w:i/>
+          <w:iCs/>
+          <w:sz w:val="26"/>
+          <w:szCs w:val="26"/>
+        </w:rPr>
+        <w:t>all</w:t>
+      </w:r>
+      <w:r>
+        <w:rPr>
+          <w:rFonts w:ascii="Times New Roman" w:eastAsia="Times New Roman" w:hAnsi="Times New Roman" w:cs="Times New Roman"/>
+          <w:sz w:val="26"/>
+          <w:szCs w:val="26"/>
+        </w:rPr>
+        <w:t xml:space="preserve"> permutations. Therefore:</w:t>
+      </w:r>
+      <w:r>
+        <w:rPr>
+          <w:rFonts w:ascii="Times New Roman" w:eastAsia="Times New Roman" w:hAnsi="Times New Roman" w:cs="Times New Roman"/>
+          <w:sz w:val="26"/>
+          <w:szCs w:val="26"/>
+        </w:rPr>
+        <w:br/>
+      </w:r>
+    </w:p>
+    <w:p>
+      <w:pPr>
+        <w:ind w:left="720"/>
+        <w:jc w:val="center"/>
+        <w:rPr>
+          <w:rFonts w:ascii="Times New Roman" w:eastAsia="Times New Roman" w:hAnsi="Times New Roman" w:cs="Times New Roman"/>
+          <w:sz w:val="26"/>
+          <w:szCs w:val="26"/>
+        </w:rPr>
+      </w:pPr>
+      <m:oMathPara>
+        <m:oMath>
+          <m:r>
+            <w:rPr>
+              <w:rFonts w:ascii="Times New Roman" w:eastAsia="Times New Roman" w:hAnsi="Times New Roman" w:cs="Times New Roman"/>
+              <w:sz w:val="26"/>
+              <w:szCs w:val="26"/>
+            </w:rPr>
+            <w:lastRenderedPageBreak/>
+            <m:t>h(s)≤</m:t>
+          </m:r>
+          <m:nary>
+            <m:naryPr>
+              <m:chr m:val="∑"/>
+              <m:ctrlPr>
+                <w:rPr>
+                  <w:rFonts w:ascii="Times New Roman" w:eastAsia="Times New Roman" w:hAnsi="Times New Roman" w:cs="Times New Roman"/>
+                  <w:sz w:val="26"/>
+                  <w:szCs w:val="26"/>
+                </w:rPr>
+              </m:ctrlPr>
+            </m:naryPr>
+            <m:sub>
+              <m:r>
+                <w:rPr>
+                  <w:rFonts w:ascii="Times New Roman" w:eastAsia="Times New Roman" w:hAnsi="Times New Roman" w:cs="Times New Roman"/>
+                  <w:sz w:val="26"/>
+                  <w:szCs w:val="26"/>
+                </w:rPr>
+                <m:t>i=1</m:t>
+              </m:r>
+            </m:sub>
+            <m:sup>
+              <m:r>
+                <w:rPr>
+                  <w:rFonts w:ascii="Times New Roman" w:eastAsia="Times New Roman" w:hAnsi="Times New Roman" w:cs="Times New Roman"/>
+                  <w:sz w:val="26"/>
+                  <w:szCs w:val="26"/>
+                </w:rPr>
+                <m:t>k</m:t>
+              </m:r>
+            </m:sup>
+            <m:e>
+              <m:r>
+                <w:rPr>
+                  <w:rFonts w:ascii="Times New Roman" w:eastAsia="Times New Roman" w:hAnsi="Times New Roman" w:cs="Times New Roman"/>
+                  <w:sz w:val="26"/>
+                  <w:szCs w:val="26"/>
+                </w:rPr>
+                <m:t>w(</m:t>
+              </m:r>
+              <m:sSub>
+                <m:sSubPr>
+                  <m:ctrlPr>
+                    <w:rPr>
+                      <w:rFonts w:ascii="Times New Roman" w:eastAsia="Times New Roman" w:hAnsi="Times New Roman" w:cs="Times New Roman"/>
+                      <w:sz w:val="26"/>
+                      <w:szCs w:val="26"/>
+                    </w:rPr>
+                  </m:ctrlPr>
+                </m:sSubPr>
+                <m:e>
+                  <m:r>
+                    <w:rPr>
+                      <w:rFonts w:ascii="Times New Roman" w:eastAsia="Times New Roman" w:hAnsi="Times New Roman" w:cs="Times New Roman"/>
+                      <w:sz w:val="26"/>
+                      <w:szCs w:val="26"/>
+                    </w:rPr>
+                    <m:t>b</m:t>
+                  </m:r>
+                </m:e>
+                <m:sub>
+                  <m:r>
+                    <w:rPr>
+                      <w:rFonts w:ascii="Times New Roman" w:eastAsia="Times New Roman" w:hAnsi="Times New Roman" w:cs="Times New Roman"/>
+                      <w:sz w:val="26"/>
+                      <w:szCs w:val="26"/>
+                    </w:rPr>
+                    <m:t>i</m:t>
+                  </m:r>
+                </m:sub>
+              </m:sSub>
+              <m:r>
+                <w:rPr>
+                  <w:rFonts w:ascii="Times New Roman" w:eastAsia="Times New Roman" w:hAnsi="Times New Roman" w:cs="Times New Roman"/>
+                  <w:sz w:val="26"/>
+                  <w:szCs w:val="26"/>
+                </w:rPr>
+                <m:t>,</m:t>
+              </m:r>
+              <m:sSub>
+                <m:sSubPr>
+                  <m:ctrlPr>
+                    <w:rPr>
+                      <w:rFonts w:ascii="Times New Roman" w:eastAsia="Times New Roman" w:hAnsi="Times New Roman" w:cs="Times New Roman"/>
+                      <w:sz w:val="26"/>
+                      <w:szCs w:val="26"/>
+                    </w:rPr>
+                  </m:ctrlPr>
+                </m:sSubPr>
+                <m:e>
+                  <m:r>
+                    <w:rPr>
+                      <w:rFonts w:ascii="Times New Roman" w:eastAsia="Times New Roman" w:hAnsi="Times New Roman" w:cs="Times New Roman"/>
+                      <w:sz w:val="26"/>
+                      <w:szCs w:val="26"/>
+                    </w:rPr>
+                    <m:t>d</m:t>
+                  </m:r>
+                </m:e>
+                <m:sub>
+                  <m:sSup>
+                    <m:sSupPr>
+                      <m:ctrlPr>
+                        <w:rPr>
+                          <w:rFonts w:ascii="Times New Roman" w:eastAsia="Times New Roman" w:hAnsi="Times New Roman" w:cs="Times New Roman"/>
+                          <w:sz w:val="26"/>
+                          <w:szCs w:val="26"/>
+                        </w:rPr>
+                      </m:ctrlPr>
+                    </m:sSupPr>
+                    <m:e>
+                      <m:r>
+                        <w:rPr>
+                          <w:rFonts w:ascii="Times New Roman" w:eastAsia="Times New Roman" w:hAnsi="Times New Roman" w:cs="Times New Roman"/>
+                          <w:sz w:val="26"/>
+                          <w:szCs w:val="26"/>
+                        </w:rPr>
+                        <m:t>π</m:t>
+                      </m:r>
+                    </m:e>
+                    <m:sup>
+                      <m:r>
+                        <w:rPr>
+                          <w:rFonts w:ascii="Times New Roman" w:eastAsia="Times New Roman" w:hAnsi="Times New Roman" w:cs="Times New Roman"/>
+                          <w:sz w:val="26"/>
+                          <w:szCs w:val="26"/>
+                        </w:rPr>
+                        <m:t>*</m:t>
+                      </m:r>
+                    </m:sup>
+                  </m:sSup>
+                  <m:r>
+                    <w:rPr>
+                      <w:rFonts w:ascii="Times New Roman" w:eastAsia="Times New Roman" w:hAnsi="Times New Roman" w:cs="Times New Roman"/>
+                      <w:sz w:val="26"/>
+                      <w:szCs w:val="26"/>
+                    </w:rPr>
+                    <m:t>(</m:t>
+                  </m:r>
+                  <m:sSub>
+                    <m:sSubPr>
+                      <m:ctrlPr>
+                        <w:rPr>
+                          <w:rFonts w:ascii="Times New Roman" w:eastAsia="Times New Roman" w:hAnsi="Times New Roman" w:cs="Times New Roman"/>
+                          <w:sz w:val="26"/>
+                          <w:szCs w:val="26"/>
+                        </w:rPr>
+                      </m:ctrlPr>
+                    </m:sSubPr>
+                    <m:e>
+                      <m:r>
+                        <w:rPr>
+                          <w:rFonts w:ascii="Times New Roman" w:eastAsia="Times New Roman" w:hAnsi="Times New Roman" w:cs="Times New Roman"/>
+                          <w:sz w:val="26"/>
+                          <w:szCs w:val="26"/>
+                        </w:rPr>
+                        <m:t>b</m:t>
+                      </m:r>
+                    </m:e>
+                    <m:sub>
+                      <m:r>
+                        <w:rPr>
+                          <w:rFonts w:ascii="Times New Roman" w:eastAsia="Times New Roman" w:hAnsi="Times New Roman" w:cs="Times New Roman"/>
+                          <w:sz w:val="26"/>
+                          <w:szCs w:val="26"/>
+                        </w:rPr>
+                        <m:t>i</m:t>
+                      </m:r>
+                    </m:sub>
+                  </m:sSub>
+                  <m:r>
+                    <w:rPr>
+                      <w:rFonts w:ascii="Times New Roman" w:eastAsia="Times New Roman" w:hAnsi="Times New Roman" w:cs="Times New Roman"/>
+                      <w:sz w:val="26"/>
+                      <w:szCs w:val="26"/>
+                    </w:rPr>
+                    <m:t>)</m:t>
+                  </m:r>
+                </m:sub>
+              </m:sSub>
+              <m:r>
+                <w:rPr>
+                  <w:rFonts w:ascii="Times New Roman" w:eastAsia="Times New Roman" w:hAnsi="Times New Roman" w:cs="Times New Roman"/>
+                  <w:sz w:val="26"/>
+                  <w:szCs w:val="26"/>
+                </w:rPr>
+                <m:t>)≤</m:t>
+              </m:r>
+              <m:sSup>
+                <m:sSupPr>
+                  <m:ctrlPr>
+                    <w:rPr>
+                      <w:rFonts w:ascii="Times New Roman" w:eastAsia="Times New Roman" w:hAnsi="Times New Roman" w:cs="Times New Roman"/>
+                      <w:sz w:val="26"/>
+                      <w:szCs w:val="26"/>
+                    </w:rPr>
+                  </m:ctrlPr>
+                </m:sSupPr>
+                <m:e>
+                  <m:r>
+                    <w:rPr>
+                      <w:rFonts w:ascii="Times New Roman" w:eastAsia="Times New Roman" w:hAnsi="Times New Roman" w:cs="Times New Roman"/>
+                      <w:sz w:val="26"/>
+                      <w:szCs w:val="26"/>
+                    </w:rPr>
+                    <m:t>h</m:t>
+                  </m:r>
+                </m:e>
+                <m:sup>
+                  <m:r>
+                    <w:rPr>
+                      <w:rFonts w:ascii="Times New Roman" w:eastAsia="Times New Roman" w:hAnsi="Times New Roman" w:cs="Times New Roman"/>
+                      <w:sz w:val="26"/>
+                      <w:szCs w:val="26"/>
+                    </w:rPr>
+                    <m:t>*</m:t>
+                  </m:r>
+                </m:sup>
+              </m:sSup>
+              <m:r>
+                <w:rPr>
+                  <w:rFonts w:ascii="Times New Roman" w:eastAsia="Times New Roman" w:hAnsi="Times New Roman" w:cs="Times New Roman"/>
+                  <w:sz w:val="26"/>
+                  <w:szCs w:val="26"/>
+                </w:rPr>
+                <m:t>(s)</m:t>
+              </m:r>
+            </m:e>
+          </m:nary>
+        </m:oMath>
+      </m:oMathPara>
     </w:p>
     <w:p>
       <w:pPr>
@@ -2989,7 +2991,6 @@
           <w:sz w:val="26"/>
           <w:szCs w:val="26"/>
         </w:rPr>
-        <w:lastRenderedPageBreak/>
         <w:t xml:space="preserve">Since </w:t>
       </w:r>
       <m:oMath>

</xml_diff>